<commit_message>
refactor: improve protocol validation and application robustness
</commit_message>
<xml_diff>
--- a/DOCX/012012301310_Group04_UDM09.docx
+++ b/DOCX/012012301310_Group04_UDM09.docx
@@ -63,7 +63,7 @@
           <wp:inline distT="0" distB="0" distL="0" distR="0" wp14:anchorId="67EE0D44" wp14:editId="327FDA19">
             <wp:extent cx="3065145" cy="699135"/>
             <wp:effectExtent l="0" t="0" r="0" b="0"/>
-            <wp:docPr id="658963541" name="Picture 658963541" descr="A close up of a logo&#10;&#10;Description automatically generated"/>
+            <wp:docPr id="658963541" name="Picture 658963541" descr="A close up of a logo  Description automatically generated"/>
             <wp:cNvGraphicFramePr>
               <a:graphicFrameLocks xmlns:a="http://schemas.openxmlformats.org/drawingml/2006/main" noChangeAspect="1"/>
             </wp:cNvGraphicFramePr>
@@ -71,7 +71,7 @@
               <a:graphicData uri="http://schemas.openxmlformats.org/drawingml/2006/picture">
                 <pic:pic xmlns:pic="http://schemas.openxmlformats.org/drawingml/2006/picture">
                   <pic:nvPicPr>
-                    <pic:cNvPr id="658963541" name="Picture 658963541" descr="A close up of a logo&#10;&#10;Description automatically generated"/>
+                    <pic:cNvPr id="658963541" name="Picture 658963541" descr="A close up of a logo  Description automatically generated"/>
                     <pic:cNvPicPr>
                       <a:picLocks noChangeAspect="1" noChangeArrowheads="1"/>
                     </pic:cNvPicPr>
@@ -333,13 +333,7 @@
         <w:rPr>
           <w:lang w:val="vi-VN"/>
         </w:rPr>
-        <w:t xml:space="preserve"> </w:t>
-      </w:r>
-      <w:r>
-        <w:rPr>
-          <w:lang w:val="vi-VN"/>
-        </w:rPr>
-        <w:t>Mai Ngọc Châu</w:t>
+        <w:t xml:space="preserve"> Mai Ngọc Châu</w:t>
       </w:r>
     </w:p>
     <w:p>
@@ -358,22 +352,13 @@
         <w:t>0120123</w:t>
       </w:r>
       <w:r>
-        <w:t>01310</w:t>
-      </w:r>
-      <w:r>
-        <w:t xml:space="preserve"> </w:t>
+        <w:t xml:space="preserve">01310 </w:t>
       </w:r>
       <w:r>
         <w:rPr>
           <w:lang w:val="vi-VN"/>
         </w:rPr>
-        <w:t xml:space="preserve">Mã học phần: </w:t>
-      </w:r>
-      <w:r>
-        <w:rPr>
-          <w:lang w:val="vi-VN"/>
-        </w:rPr>
-        <w:t>7480201390613</w:t>
+        <w:t xml:space="preserve">Mã học phần: 7480201390613</w:t>
       </w:r>
     </w:p>
     <w:p>
@@ -807,14 +792,7 @@
                 <w:sz w:val="28"/>
                 <w:szCs w:val="28"/>
               </w:rPr>
-              <w:t>Nguyễn P. Hoài B</w:t>
-            </w:r>
-            <w:r>
-              <w:rPr>
-                <w:sz w:val="28"/>
-                <w:szCs w:val="28"/>
-              </w:rPr>
-              <w:t>in</w:t>
+              <w:t>Nguyễn P. Hoài Bin</w:t>
             </w:r>
           </w:p>
         </w:tc>
@@ -1157,11 +1135,7 @@
           </w:pPr>
           <w:r>
             <w:fldChar w:fldCharType="begin"/>
-          </w:r>
-          <w:r>
             <w:instrText xml:space="preserve"> TOC \o "1-3" \h \z \u </w:instrText>
-          </w:r>
-          <w:r>
             <w:fldChar w:fldCharType="separate"/>
           </w:r>
           <w:hyperlink w:anchor="_Toc233832268" w:history="1">
@@ -1176,40 +1150,10 @@
                 <w:webHidden/>
               </w:rPr>
               <w:tab/>
-            </w:r>
-            <w:r>
-              <w:rPr>
-                <w:webHidden/>
-              </w:rPr>
               <w:fldChar w:fldCharType="begin"/>
-            </w:r>
-            <w:r>
-              <w:rPr>
-                <w:webHidden/>
-              </w:rPr>
               <w:instrText xml:space="preserve"> PAGEREF _Toc233832268 \h </w:instrText>
-            </w:r>
-            <w:r>
-              <w:rPr>
-                <w:webHidden/>
-              </w:rPr>
-            </w:r>
-            <w:r>
-              <w:rPr>
-                <w:webHidden/>
-              </w:rPr>
               <w:fldChar w:fldCharType="separate"/>
-            </w:r>
-            <w:r>
-              <w:rPr>
-                <w:webHidden/>
-              </w:rPr>
               <w:t>2</w:t>
-            </w:r>
-            <w:r>
-              <w:rPr>
-                <w:webHidden/>
-              </w:rPr>
               <w:fldChar w:fldCharType="end"/>
             </w:r>
           </w:hyperlink>
@@ -1237,40 +1181,10 @@
                 <w:webHidden/>
               </w:rPr>
               <w:tab/>
-            </w:r>
-            <w:r>
-              <w:rPr>
-                <w:webHidden/>
-              </w:rPr>
               <w:fldChar w:fldCharType="begin"/>
-            </w:r>
-            <w:r>
-              <w:rPr>
-                <w:webHidden/>
-              </w:rPr>
               <w:instrText xml:space="preserve"> PAGEREF _Toc233832269 \h </w:instrText>
-            </w:r>
-            <w:r>
-              <w:rPr>
-                <w:webHidden/>
-              </w:rPr>
-            </w:r>
-            <w:r>
-              <w:rPr>
-                <w:webHidden/>
-              </w:rPr>
               <w:fldChar w:fldCharType="separate"/>
-            </w:r>
-            <w:r>
-              <w:rPr>
-                <w:webHidden/>
-              </w:rPr>
               <w:t>3</w:t>
-            </w:r>
-            <w:r>
-              <w:rPr>
-                <w:webHidden/>
-              </w:rPr>
               <w:fldChar w:fldCharType="end"/>
             </w:r>
           </w:hyperlink>
@@ -1304,46 +1218,10 @@
                 <w:webHidden/>
               </w:rPr>
               <w:tab/>
-            </w:r>
-            <w:r>
-              <w:rPr>
-                <w:noProof/>
-                <w:webHidden/>
-              </w:rPr>
               <w:fldChar w:fldCharType="begin"/>
-            </w:r>
-            <w:r>
-              <w:rPr>
-                <w:noProof/>
-                <w:webHidden/>
-              </w:rPr>
               <w:instrText xml:space="preserve"> PAGEREF _Toc233832270 \h </w:instrText>
-            </w:r>
-            <w:r>
-              <w:rPr>
-                <w:noProof/>
-                <w:webHidden/>
-              </w:rPr>
-            </w:r>
-            <w:r>
-              <w:rPr>
-                <w:noProof/>
-                <w:webHidden/>
-              </w:rPr>
               <w:fldChar w:fldCharType="separate"/>
-            </w:r>
-            <w:r>
-              <w:rPr>
-                <w:noProof/>
-                <w:webHidden/>
-              </w:rPr>
               <w:t>3</w:t>
-            </w:r>
-            <w:r>
-              <w:rPr>
-                <w:noProof/>
-                <w:webHidden/>
-              </w:rPr>
               <w:fldChar w:fldCharType="end"/>
             </w:r>
           </w:hyperlink>
@@ -1377,46 +1255,10 @@
                 <w:webHidden/>
               </w:rPr>
               <w:tab/>
-            </w:r>
-            <w:r>
-              <w:rPr>
-                <w:noProof/>
-                <w:webHidden/>
-              </w:rPr>
               <w:fldChar w:fldCharType="begin"/>
-            </w:r>
-            <w:r>
-              <w:rPr>
-                <w:noProof/>
-                <w:webHidden/>
-              </w:rPr>
               <w:instrText xml:space="preserve"> PAGEREF _Toc233832271 \h </w:instrText>
-            </w:r>
-            <w:r>
-              <w:rPr>
-                <w:noProof/>
-                <w:webHidden/>
-              </w:rPr>
-            </w:r>
-            <w:r>
-              <w:rPr>
-                <w:noProof/>
-                <w:webHidden/>
-              </w:rPr>
               <w:fldChar w:fldCharType="separate"/>
-            </w:r>
-            <w:r>
-              <w:rPr>
-                <w:noProof/>
-                <w:webHidden/>
-              </w:rPr>
               <w:t>3</w:t>
-            </w:r>
-            <w:r>
-              <w:rPr>
-                <w:noProof/>
-                <w:webHidden/>
-              </w:rPr>
               <w:fldChar w:fldCharType="end"/>
             </w:r>
           </w:hyperlink>
@@ -1444,40 +1286,10 @@
                 <w:webHidden/>
               </w:rPr>
               <w:tab/>
-            </w:r>
-            <w:r>
-              <w:rPr>
-                <w:webHidden/>
-              </w:rPr>
               <w:fldChar w:fldCharType="begin"/>
-            </w:r>
-            <w:r>
-              <w:rPr>
-                <w:webHidden/>
-              </w:rPr>
               <w:instrText xml:space="preserve"> PAGEREF _Toc233832272 \h </w:instrText>
-            </w:r>
-            <w:r>
-              <w:rPr>
-                <w:webHidden/>
-              </w:rPr>
-            </w:r>
-            <w:r>
-              <w:rPr>
-                <w:webHidden/>
-              </w:rPr>
               <w:fldChar w:fldCharType="separate"/>
-            </w:r>
-            <w:r>
-              <w:rPr>
-                <w:webHidden/>
-              </w:rPr>
               <w:t>3</w:t>
-            </w:r>
-            <w:r>
-              <w:rPr>
-                <w:webHidden/>
-              </w:rPr>
               <w:fldChar w:fldCharType="end"/>
             </w:r>
           </w:hyperlink>
@@ -1511,46 +1323,10 @@
                 <w:webHidden/>
               </w:rPr>
               <w:tab/>
-            </w:r>
-            <w:r>
-              <w:rPr>
-                <w:noProof/>
-                <w:webHidden/>
-              </w:rPr>
               <w:fldChar w:fldCharType="begin"/>
-            </w:r>
-            <w:r>
-              <w:rPr>
-                <w:noProof/>
-                <w:webHidden/>
-              </w:rPr>
               <w:instrText xml:space="preserve"> PAGEREF _Toc233832273 \h </w:instrText>
-            </w:r>
-            <w:r>
-              <w:rPr>
-                <w:noProof/>
-                <w:webHidden/>
-              </w:rPr>
-            </w:r>
-            <w:r>
-              <w:rPr>
-                <w:noProof/>
-                <w:webHidden/>
-              </w:rPr>
               <w:fldChar w:fldCharType="separate"/>
-            </w:r>
-            <w:r>
-              <w:rPr>
-                <w:noProof/>
-                <w:webHidden/>
-              </w:rPr>
               <w:t>3</w:t>
-            </w:r>
-            <w:r>
-              <w:rPr>
-                <w:noProof/>
-                <w:webHidden/>
-              </w:rPr>
               <w:fldChar w:fldCharType="end"/>
             </w:r>
           </w:hyperlink>
@@ -1584,46 +1360,10 @@
                 <w:webHidden/>
               </w:rPr>
               <w:tab/>
-            </w:r>
-            <w:r>
-              <w:rPr>
-                <w:noProof/>
-                <w:webHidden/>
-              </w:rPr>
               <w:fldChar w:fldCharType="begin"/>
-            </w:r>
-            <w:r>
-              <w:rPr>
-                <w:noProof/>
-                <w:webHidden/>
-              </w:rPr>
               <w:instrText xml:space="preserve"> PAGEREF _Toc233832274 \h </w:instrText>
-            </w:r>
-            <w:r>
-              <w:rPr>
-                <w:noProof/>
-                <w:webHidden/>
-              </w:rPr>
-            </w:r>
-            <w:r>
-              <w:rPr>
-                <w:noProof/>
-                <w:webHidden/>
-              </w:rPr>
               <w:fldChar w:fldCharType="separate"/>
-            </w:r>
-            <w:r>
-              <w:rPr>
-                <w:noProof/>
-                <w:webHidden/>
-              </w:rPr>
               <w:t>4</w:t>
-            </w:r>
-            <w:r>
-              <w:rPr>
-                <w:noProof/>
-                <w:webHidden/>
-              </w:rPr>
               <w:fldChar w:fldCharType="end"/>
             </w:r>
           </w:hyperlink>
@@ -1657,46 +1397,10 @@
                 <w:webHidden/>
               </w:rPr>
               <w:tab/>
-            </w:r>
-            <w:r>
-              <w:rPr>
-                <w:noProof/>
-                <w:webHidden/>
-              </w:rPr>
               <w:fldChar w:fldCharType="begin"/>
-            </w:r>
-            <w:r>
-              <w:rPr>
-                <w:noProof/>
-                <w:webHidden/>
-              </w:rPr>
               <w:instrText xml:space="preserve"> PAGEREF _Toc233832275 \h </w:instrText>
-            </w:r>
-            <w:r>
-              <w:rPr>
-                <w:noProof/>
-                <w:webHidden/>
-              </w:rPr>
-            </w:r>
-            <w:r>
-              <w:rPr>
-                <w:noProof/>
-                <w:webHidden/>
-              </w:rPr>
               <w:fldChar w:fldCharType="separate"/>
-            </w:r>
-            <w:r>
-              <w:rPr>
-                <w:noProof/>
-                <w:webHidden/>
-              </w:rPr>
               <w:t>4</w:t>
-            </w:r>
-            <w:r>
-              <w:rPr>
-                <w:noProof/>
-                <w:webHidden/>
-              </w:rPr>
               <w:fldChar w:fldCharType="end"/>
             </w:r>
           </w:hyperlink>
@@ -1724,40 +1428,10 @@
                 <w:webHidden/>
               </w:rPr>
               <w:tab/>
-            </w:r>
-            <w:r>
-              <w:rPr>
-                <w:webHidden/>
-              </w:rPr>
               <w:fldChar w:fldCharType="begin"/>
-            </w:r>
-            <w:r>
-              <w:rPr>
-                <w:webHidden/>
-              </w:rPr>
               <w:instrText xml:space="preserve"> PAGEREF _Toc233832276 \h </w:instrText>
-            </w:r>
-            <w:r>
-              <w:rPr>
-                <w:webHidden/>
-              </w:rPr>
-            </w:r>
-            <w:r>
-              <w:rPr>
-                <w:webHidden/>
-              </w:rPr>
               <w:fldChar w:fldCharType="separate"/>
-            </w:r>
-            <w:r>
-              <w:rPr>
-                <w:webHidden/>
-              </w:rPr>
               <w:t>4</w:t>
-            </w:r>
-            <w:r>
-              <w:rPr>
-                <w:webHidden/>
-              </w:rPr>
               <w:fldChar w:fldCharType="end"/>
             </w:r>
           </w:hyperlink>
@@ -1785,40 +1459,10 @@
                 <w:webHidden/>
               </w:rPr>
               <w:tab/>
-            </w:r>
-            <w:r>
-              <w:rPr>
-                <w:webHidden/>
-              </w:rPr>
               <w:fldChar w:fldCharType="begin"/>
-            </w:r>
-            <w:r>
-              <w:rPr>
-                <w:webHidden/>
-              </w:rPr>
               <w:instrText xml:space="preserve"> PAGEREF _Toc233832277 \h </w:instrText>
-            </w:r>
-            <w:r>
-              <w:rPr>
-                <w:webHidden/>
-              </w:rPr>
-            </w:r>
-            <w:r>
-              <w:rPr>
-                <w:webHidden/>
-              </w:rPr>
               <w:fldChar w:fldCharType="separate"/>
-            </w:r>
-            <w:r>
-              <w:rPr>
-                <w:webHidden/>
-              </w:rPr>
               <w:t>4</w:t>
-            </w:r>
-            <w:r>
-              <w:rPr>
-                <w:webHidden/>
-              </w:rPr>
               <w:fldChar w:fldCharType="end"/>
             </w:r>
           </w:hyperlink>
@@ -1846,40 +1490,10 @@
                 <w:webHidden/>
               </w:rPr>
               <w:tab/>
-            </w:r>
-            <w:r>
-              <w:rPr>
-                <w:webHidden/>
-              </w:rPr>
               <w:fldChar w:fldCharType="begin"/>
-            </w:r>
-            <w:r>
-              <w:rPr>
-                <w:webHidden/>
-              </w:rPr>
               <w:instrText xml:space="preserve"> PAGEREF _Toc233832278 \h </w:instrText>
-            </w:r>
-            <w:r>
-              <w:rPr>
-                <w:webHidden/>
-              </w:rPr>
-            </w:r>
-            <w:r>
-              <w:rPr>
-                <w:webHidden/>
-              </w:rPr>
               <w:fldChar w:fldCharType="separate"/>
-            </w:r>
-            <w:r>
-              <w:rPr>
-                <w:webHidden/>
-              </w:rPr>
               <w:t>5</w:t>
-            </w:r>
-            <w:r>
-              <w:rPr>
-                <w:webHidden/>
-              </w:rPr>
               <w:fldChar w:fldCharType="end"/>
             </w:r>
           </w:hyperlink>
@@ -1913,46 +1527,10 @@
                 <w:webHidden/>
               </w:rPr>
               <w:tab/>
-            </w:r>
-            <w:r>
-              <w:rPr>
-                <w:noProof/>
-                <w:webHidden/>
-              </w:rPr>
               <w:fldChar w:fldCharType="begin"/>
-            </w:r>
-            <w:r>
-              <w:rPr>
-                <w:noProof/>
-                <w:webHidden/>
-              </w:rPr>
               <w:instrText xml:space="preserve"> PAGEREF _Toc233832279 \h </w:instrText>
-            </w:r>
-            <w:r>
-              <w:rPr>
-                <w:noProof/>
-                <w:webHidden/>
-              </w:rPr>
-            </w:r>
-            <w:r>
-              <w:rPr>
-                <w:noProof/>
-                <w:webHidden/>
-              </w:rPr>
               <w:fldChar w:fldCharType="separate"/>
-            </w:r>
-            <w:r>
-              <w:rPr>
-                <w:noProof/>
-                <w:webHidden/>
-              </w:rPr>
               <w:t>5</w:t>
-            </w:r>
-            <w:r>
-              <w:rPr>
-                <w:noProof/>
-                <w:webHidden/>
-              </w:rPr>
               <w:fldChar w:fldCharType="end"/>
             </w:r>
           </w:hyperlink>
@@ -1986,46 +1564,10 @@
                 <w:webHidden/>
               </w:rPr>
               <w:tab/>
-            </w:r>
-            <w:r>
-              <w:rPr>
-                <w:noProof/>
-                <w:webHidden/>
-              </w:rPr>
               <w:fldChar w:fldCharType="begin"/>
-            </w:r>
-            <w:r>
-              <w:rPr>
-                <w:noProof/>
-                <w:webHidden/>
-              </w:rPr>
               <w:instrText xml:space="preserve"> PAGEREF _Toc233832280 \h </w:instrText>
-            </w:r>
-            <w:r>
-              <w:rPr>
-                <w:noProof/>
-                <w:webHidden/>
-              </w:rPr>
-            </w:r>
-            <w:r>
-              <w:rPr>
-                <w:noProof/>
-                <w:webHidden/>
-              </w:rPr>
               <w:fldChar w:fldCharType="separate"/>
-            </w:r>
-            <w:r>
-              <w:rPr>
-                <w:noProof/>
-                <w:webHidden/>
-              </w:rPr>
               <w:t>5</w:t>
-            </w:r>
-            <w:r>
-              <w:rPr>
-                <w:noProof/>
-                <w:webHidden/>
-              </w:rPr>
               <w:fldChar w:fldCharType="end"/>
             </w:r>
           </w:hyperlink>
@@ -2059,46 +1601,10 @@
                 <w:webHidden/>
               </w:rPr>
               <w:tab/>
-            </w:r>
-            <w:r>
-              <w:rPr>
-                <w:noProof/>
-                <w:webHidden/>
-              </w:rPr>
               <w:fldChar w:fldCharType="begin"/>
-            </w:r>
-            <w:r>
-              <w:rPr>
-                <w:noProof/>
-                <w:webHidden/>
-              </w:rPr>
               <w:instrText xml:space="preserve"> PAGEREF _Toc233832281 \h </w:instrText>
-            </w:r>
-            <w:r>
-              <w:rPr>
-                <w:noProof/>
-                <w:webHidden/>
-              </w:rPr>
-            </w:r>
-            <w:r>
-              <w:rPr>
-                <w:noProof/>
-                <w:webHidden/>
-              </w:rPr>
               <w:fldChar w:fldCharType="separate"/>
-            </w:r>
-            <w:r>
-              <w:rPr>
-                <w:noProof/>
-                <w:webHidden/>
-              </w:rPr>
               <w:t>5</w:t>
-            </w:r>
-            <w:r>
-              <w:rPr>
-                <w:noProof/>
-                <w:webHidden/>
-              </w:rPr>
               <w:fldChar w:fldCharType="end"/>
             </w:r>
           </w:hyperlink>
@@ -2132,46 +1638,10 @@
                 <w:webHidden/>
               </w:rPr>
               <w:tab/>
-            </w:r>
-            <w:r>
-              <w:rPr>
-                <w:noProof/>
-                <w:webHidden/>
-              </w:rPr>
               <w:fldChar w:fldCharType="begin"/>
-            </w:r>
-            <w:r>
-              <w:rPr>
-                <w:noProof/>
-                <w:webHidden/>
-              </w:rPr>
               <w:instrText xml:space="preserve"> PAGEREF _Toc233832282 \h </w:instrText>
-            </w:r>
-            <w:r>
-              <w:rPr>
-                <w:noProof/>
-                <w:webHidden/>
-              </w:rPr>
-            </w:r>
-            <w:r>
-              <w:rPr>
-                <w:noProof/>
-                <w:webHidden/>
-              </w:rPr>
               <w:fldChar w:fldCharType="separate"/>
-            </w:r>
-            <w:r>
-              <w:rPr>
-                <w:noProof/>
-                <w:webHidden/>
-              </w:rPr>
               <w:t>6</w:t>
-            </w:r>
-            <w:r>
-              <w:rPr>
-                <w:noProof/>
-                <w:webHidden/>
-              </w:rPr>
               <w:fldChar w:fldCharType="end"/>
             </w:r>
           </w:hyperlink>
@@ -2205,46 +1675,10 @@
                 <w:webHidden/>
               </w:rPr>
               <w:tab/>
-            </w:r>
-            <w:r>
-              <w:rPr>
-                <w:noProof/>
-                <w:webHidden/>
-              </w:rPr>
               <w:fldChar w:fldCharType="begin"/>
-            </w:r>
-            <w:r>
-              <w:rPr>
-                <w:noProof/>
-                <w:webHidden/>
-              </w:rPr>
               <w:instrText xml:space="preserve"> PAGEREF _Toc233832283 \h </w:instrText>
-            </w:r>
-            <w:r>
-              <w:rPr>
-                <w:noProof/>
-                <w:webHidden/>
-              </w:rPr>
-            </w:r>
-            <w:r>
-              <w:rPr>
-                <w:noProof/>
-                <w:webHidden/>
-              </w:rPr>
               <w:fldChar w:fldCharType="separate"/>
-            </w:r>
-            <w:r>
-              <w:rPr>
-                <w:noProof/>
-                <w:webHidden/>
-              </w:rPr>
               <w:t>6</w:t>
-            </w:r>
-            <w:r>
-              <w:rPr>
-                <w:noProof/>
-                <w:webHidden/>
-              </w:rPr>
               <w:fldChar w:fldCharType="end"/>
             </w:r>
           </w:hyperlink>
@@ -2278,46 +1712,10 @@
                 <w:webHidden/>
               </w:rPr>
               <w:tab/>
-            </w:r>
-            <w:r>
-              <w:rPr>
-                <w:noProof/>
-                <w:webHidden/>
-              </w:rPr>
               <w:fldChar w:fldCharType="begin"/>
-            </w:r>
-            <w:r>
-              <w:rPr>
-                <w:noProof/>
-                <w:webHidden/>
-              </w:rPr>
               <w:instrText xml:space="preserve"> PAGEREF _Toc233832284 \h </w:instrText>
-            </w:r>
-            <w:r>
-              <w:rPr>
-                <w:noProof/>
-                <w:webHidden/>
-              </w:rPr>
-            </w:r>
-            <w:r>
-              <w:rPr>
-                <w:noProof/>
-                <w:webHidden/>
-              </w:rPr>
               <w:fldChar w:fldCharType="separate"/>
-            </w:r>
-            <w:r>
-              <w:rPr>
-                <w:noProof/>
-                <w:webHidden/>
-              </w:rPr>
               <w:t>6</w:t>
-            </w:r>
-            <w:r>
-              <w:rPr>
-                <w:noProof/>
-                <w:webHidden/>
-              </w:rPr>
               <w:fldChar w:fldCharType="end"/>
             </w:r>
           </w:hyperlink>
@@ -2345,40 +1743,10 @@
                 <w:webHidden/>
               </w:rPr>
               <w:tab/>
-            </w:r>
-            <w:r>
-              <w:rPr>
-                <w:webHidden/>
-              </w:rPr>
               <w:fldChar w:fldCharType="begin"/>
-            </w:r>
-            <w:r>
-              <w:rPr>
-                <w:webHidden/>
-              </w:rPr>
               <w:instrText xml:space="preserve"> PAGEREF _Toc233832285 \h </w:instrText>
-            </w:r>
-            <w:r>
-              <w:rPr>
-                <w:webHidden/>
-              </w:rPr>
-            </w:r>
-            <w:r>
-              <w:rPr>
-                <w:webHidden/>
-              </w:rPr>
               <w:fldChar w:fldCharType="separate"/>
-            </w:r>
-            <w:r>
-              <w:rPr>
-                <w:webHidden/>
-              </w:rPr>
               <w:t>6</w:t>
-            </w:r>
-            <w:r>
-              <w:rPr>
-                <w:webHidden/>
-              </w:rPr>
               <w:fldChar w:fldCharType="end"/>
             </w:r>
           </w:hyperlink>
@@ -2413,30 +1781,12 @@
     </w:p>
     <w:p>
       <w:r>
-        <w:t>Kính gửi Thầy</w:t>
-      </w:r>
-      <w:r>
-        <w:t xml:space="preserve"> Mai Ngọc Châu</w:t>
-      </w:r>
-      <w:r>
-        <w:t>,</w:t>
-      </w:r>
-    </w:p>
-    <w:p>
-      <w:r>
-        <w:t>Dưới đây là báo cáo tóm tắt nội dung đồ án "Ứng dụng nhắn tin P2P</w:t>
-      </w:r>
-      <w:r>
-        <w:t>c</w:t>
-      </w:r>
-      <w:r>
-        <w:t>hat</w:t>
-      </w:r>
-      <w:r>
-        <w:t xml:space="preserve"> (UDM09)</w:t>
-      </w:r>
-      <w:r>
-        <w:t>" do Nhóm 04 thực hiện. Báo cáo này trình bày tổng quan về hệ thống, cơ sở lý thuyết, quá trình phân công nhiệm vụ chi tiết của từng thành viên và những bài học nhóm đã đúc kết được</w:t>
+        <w:t xml:space="preserve">Kính gửi Thầy Mai Ngọc Châu,</w:t>
+      </w:r>
+    </w:p>
+    <w:p>
+      <w:r>
+        <w:t xml:space="preserve">Dưới đây là báo cáo tóm tắt nội dung đồ án "Ứng dụng nhắn tin P2Pchat (UDM09)" do Nhóm 04 thực hiện. Báo cáo này trình bày tổng quan về hệ thống, cơ sở lý thuyết, quá trình phân công nhiệm vụ chi tiết của từng thành viên và những bài học nhóm đã đúc kết được</w:t>
       </w:r>
     </w:p>
     <w:p>
@@ -2451,10 +1801,7 @@
       <w:bookmarkStart w:id="1" w:name="_Toc233832269"/>
       <w:r>
         <w:lastRenderedPageBreak/>
-        <w:t xml:space="preserve">1. </w:t>
-      </w:r>
-      <w:r>
-        <w:t>TỔNG QUAN DỰ ÁN</w:t>
+        <w:t xml:space="preserve">1. TỔNG QUAN DỰ ÁN</w:t>
       </w:r>
       <w:bookmarkEnd w:id="1"/>
     </w:p>
@@ -2492,10 +1839,7 @@
         </w:numPr>
       </w:pPr>
       <w:r>
-        <w:t>Ngôn ngữ &amp; Framework: Python 3.13+, CustomTkinter</w:t>
-      </w:r>
-      <w:r>
-        <w:t xml:space="preserve"> + Tkinter</w:t>
+        <w:t xml:space="preserve">Ngôn ngữ &amp; Framework: Python 3.13+, CustomTkinter + Tkinter</w:t>
       </w:r>
     </w:p>
     <w:p>
@@ -2567,10 +1911,7 @@
       </w:pPr>
       <w:bookmarkStart w:id="3" w:name="_Toc233832271"/>
       <w:r>
-        <w:t xml:space="preserve">1.2. </w:t>
-      </w:r>
-      <w:r>
-        <w:t>Mục tiêu đồ án</w:t>
+        <w:t xml:space="preserve">1.2. Mục tiêu đồ án</w:t>
       </w:r>
       <w:bookmarkEnd w:id="3"/>
     </w:p>
@@ -2675,7 +2016,7 @@
         </w:numPr>
       </w:pPr>
       <w:r>
-        <w:t>Tầng Thông điệp (JSON + Fernet): Có 11 loại packet khác nhau (HELLO, CHAT, FILE_CHUNK,...), mã hóa bằng Fernet sau khi trao đổi khóa.</w:t>
+        <w:t>Tầng Thông điệp (JSON + Fernet): Có 14 loại packet khác nhau (HANDSHAKE, MESSAGE, FILE_CHUNK,...), mã hóa bằng Fernet sau khi trao đổi khóa.</w:t>
       </w:r>
     </w:p>
     <w:p>
@@ -2710,10 +2051,7 @@
         </w:numPr>
       </w:pPr>
       <w:r>
-        <w:t>Mã hóa luồng: Fernet (AES-128) mã hóa mọi tin nhắn và file truyền đi</w:t>
-      </w:r>
-      <w:r>
-        <w:t>.</w:t>
+        <w:t>Mã hóa luồng: Fernet (AES-128) mã hóa mọi tin nhắn và file truyền đi.</w:t>
       </w:r>
     </w:p>
     <w:p>
@@ -2737,7 +2075,7 @@
         </w:numPr>
       </w:pPr>
       <w:r>
-        <w:t>Chống Replay Attack: Lưu vết message_id trong 5 phút để loại bỏ gói tin bị hacker gửi lặp lại.</w:t>
+        <w:t>Chống Replay Attack: Lưu vết 4096 message_id gần nhất (deque + set) để loại bỏ gói tin gửi lặp lại, cộng thêm lớp kiểm tra tuổi gói tin (quá 5 phút bị từ chối) để không phụ thuộc hoàn toàn vào kích thước cố định của deque.</w:t>
       </w:r>
     </w:p>
     <w:p>
@@ -2952,10 +2290,7 @@
       </w:pPr>
       <w:bookmarkStart w:id="9" w:name="_Toc233832277"/>
       <w:r>
-        <w:t>4</w:t>
-      </w:r>
-      <w:r>
-        <w:t>. PHÂN CÔNG NHIỆM VỤ NHÓM</w:t>
+        <w:t>4. PHÂN CÔNG NHIỆM VỤ NHÓM</w:t>
       </w:r>
       <w:bookmarkEnd w:id="9"/>
     </w:p>
@@ -3050,8 +2385,6 @@
           <w:p>
             <w:r>
               <w:t>Trần Hữu Tài</w:t>
-            </w:r>
-            <w:r>
               <w:br/>
               <w:t>(089205009200)</w:t>
             </w:r>
@@ -3064,8 +2397,6 @@
           <w:p>
             <w:r>
               <w:t>Core Network &amp; Cấu hình</w:t>
-            </w:r>
-            <w:r>
               <w:br/>
               <w:t>(network, main.py)</w:t>
             </w:r>
@@ -3100,8 +2431,6 @@
           <w:p>
             <w:r>
               <w:t>Nguyễn Văn Tài</w:t>
-            </w:r>
-            <w:r>
               <w:br/>
               <w:t>(052206013184)</w:t>
             </w:r>
@@ -3114,8 +2443,6 @@
           <w:p>
             <w:r>
               <w:t>Bảo mật &amp; Định danh</w:t>
-            </w:r>
-            <w:r>
               <w:br/>
               <w:t>(identity, security)</w:t>
             </w:r>
@@ -3128,8 +2455,6 @@
           <w:p>
             <w:r>
               <w:t xml:space="preserve">Xây dựng PKI (RSA-2048), sinh Peer ID băm bằng SHA-256. Đóng </w:t>
-            </w:r>
-            <w:r>
               <w:lastRenderedPageBreak/>
               <w:t>gói JWT và mã hóa đường truyền Fernet.</w:t>
             </w:r>
@@ -3156,8 +2481,6 @@
             <w:r>
               <w:lastRenderedPageBreak/>
               <w:t>Nguyễn P. Hoài Bình</w:t>
-            </w:r>
-            <w:r>
               <w:br/>
               <w:t>(052206003938)</w:t>
             </w:r>
@@ -3170,8 +2493,6 @@
           <w:p>
             <w:r>
               <w:t>Giao thức &amp; Truyền tải File</w:t>
-            </w:r>
-            <w:r>
               <w:br/>
               <w:t>(message, transfer)</w:t>
             </w:r>
@@ -3206,8 +2527,6 @@
           <w:p>
             <w:r>
               <w:t>Lê Quốc Thịnh</w:t>
-            </w:r>
-            <w:r>
               <w:br/>
               <w:t>(082206002652)</w:t>
             </w:r>
@@ -3220,8 +2539,6 @@
           <w:p>
             <w:r>
               <w:t>Lưu trữ &amp; TOFU Engine</w:t>
-            </w:r>
-            <w:r>
               <w:br/>
               <w:t>(storage, trust)</w:t>
             </w:r>
@@ -3256,8 +2573,6 @@
           <w:p>
             <w:r>
               <w:t>Trần T. Thanh Thơ</w:t>
-            </w:r>
-            <w:r>
               <w:br/>
               <w:t>(080306012851)</w:t>
             </w:r>
@@ -3270,8 +2585,6 @@
           <w:p>
             <w:r>
               <w:t>GUI &amp; Controller Adapter</w:t>
-            </w:r>
-            <w:r>
               <w:br/>
               <w:t>(gui, controllers)</w:t>
             </w:r>
@@ -3305,10 +2618,7 @@
       </w:pPr>
       <w:bookmarkStart w:id="10" w:name="_Toc233832278"/>
       <w:r>
-        <w:t>5</w:t>
-      </w:r>
-      <w:r>
-        <w:t>. KẾT QUẢ ĐẠT ĐƯỢC VÀ BÀI HỌC</w:t>
+        <w:t>5. KẾT QUẢ ĐẠT ĐƯỢC VÀ BÀI HỌC</w:t>
       </w:r>
       <w:bookmarkEnd w:id="10"/>
     </w:p>
@@ -3318,10 +2628,7 @@
       </w:pPr>
       <w:bookmarkStart w:id="11" w:name="_Toc233832279"/>
       <w:r>
-        <w:t>5</w:t>
-      </w:r>
-      <w:r>
-        <w:t>.1. Kết quả</w:t>
+        <w:t>5.1. Kết quả</w:t>
       </w:r>
       <w:bookmarkEnd w:id="11"/>
     </w:p>
@@ -3370,19 +2677,7 @@
         </w:numPr>
       </w:pPr>
       <w:r>
-        <w:t xml:space="preserve">Codebase </w:t>
-      </w:r>
-      <w:r>
-        <w:t>ổn định</w:t>
-      </w:r>
-      <w:r>
-        <w:t xml:space="preserve"> với 8 packages, cấu hình tập trung và </w:t>
-      </w:r>
-      <w:r>
-        <w:t>passed</w:t>
-      </w:r>
-      <w:r>
-        <w:t xml:space="preserve"> 187/187 Unit Tests.</w:t>
+        <w:t xml:space="preserve">Codebase ổn định với 8 packages, cấu hình tập trung và passed 200/200 Unit Tests.</w:t>
       </w:r>
     </w:p>
     <w:p>
@@ -3391,13 +2686,7 @@
       </w:pPr>
       <w:bookmarkStart w:id="12" w:name="_Toc233832280"/>
       <w:r>
-        <w:t>5</w:t>
-      </w:r>
-      <w:r>
-        <w:t xml:space="preserve">.2. </w:t>
-      </w:r>
-      <w:r>
-        <w:t>Khó khăn kỹ thuật và phân tích nguyên nhân</w:t>
+        <w:t xml:space="preserve">5.2. Khó khăn kỹ thuật và phân tích nguyên nhân</w:t>
       </w:r>
       <w:bookmarkEnd w:id="12"/>
     </w:p>
@@ -3407,13 +2696,7 @@
       </w:pPr>
       <w:bookmarkStart w:id="13" w:name="_Toc233832281"/>
       <w:r>
-        <w:t>5</w:t>
-      </w:r>
-      <w:r>
-        <w:t xml:space="preserve">.2.1. </w:t>
-      </w:r>
-      <w:r>
-        <w:t>Dính gói dữ liệu (Sticky Packets) trong TCP</w:t>
+        <w:t xml:space="preserve">5.2.1. Dính gói dữ liệu (Sticky Packets) trong TCP</w:t>
       </w:r>
       <w:bookmarkEnd w:id="13"/>
     </w:p>
@@ -3462,13 +2745,7 @@
       <w:bookmarkStart w:id="14" w:name="_Toc233832282"/>
       <w:r>
         <w:lastRenderedPageBreak/>
-        <w:t>5</w:t>
-      </w:r>
-      <w:r>
-        <w:t xml:space="preserve">.2.2. </w:t>
-      </w:r>
-      <w:r>
-        <w:t>Treo giao diện (GUI Blocking) và Xung đột Render</w:t>
+        <w:t xml:space="preserve">5.2.2. Treo giao diện (GUI Blocking) và Xung đột Render</w:t>
       </w:r>
       <w:bookmarkEnd w:id="14"/>
     </w:p>
@@ -3516,13 +2793,7 @@
       </w:pPr>
       <w:bookmarkStart w:id="15" w:name="_Toc233832283"/>
       <w:r>
-        <w:t>5</w:t>
-      </w:r>
-      <w:r>
-        <w:t xml:space="preserve">.2.3. </w:t>
-      </w:r>
-      <w:r>
-        <w:t>Sự cố ngắt kết nối OS (Broken Pipe / Connection Reset)</w:t>
+        <w:t xml:space="preserve">5.2.3. Sự cố ngắt kết nối OS (Broken Pipe / Connection Reset)</w:t>
       </w:r>
       <w:bookmarkEnd w:id="15"/>
     </w:p>
@@ -3561,10 +2832,7 @@
         <w:t>Giải pháp:</w:t>
       </w:r>
       <w:r>
-        <w:t xml:space="preserve"> Bọc mọi thao tác I/O trong khối try-except. Cài đặt cơ chế UDP Heartbeat (timeout 15s) để dọn dẹp tài nguyên và giải phóng File Descriptor cho các Peer bị ngắt mạng</w:t>
-      </w:r>
-      <w:r>
-        <w:t>.</w:t>
+        <w:t xml:space="preserve"> Bọc mọi thao tác I/O trong khối try-except. Cài đặt cơ chế UDP Heartbeat (timeout 15s) để dọn dẹp tài nguyên và giải phóng File Descriptor cho các Peer bị ngắt mạng.</w:t>
       </w:r>
     </w:p>
     <w:p>
@@ -3573,13 +2841,7 @@
       </w:pPr>
       <w:bookmarkStart w:id="16" w:name="_Toc233832284"/>
       <w:r>
-        <w:t>5</w:t>
-      </w:r>
-      <w:r>
-        <w:t xml:space="preserve">.3. </w:t>
-      </w:r>
-      <w:r>
-        <w:t>Đánh giá kiến trúc và hướng phát triển</w:t>
+        <w:t xml:space="preserve">5.3. Đánh giá kiến trúc và hướng phát triển</w:t>
       </w:r>
       <w:bookmarkEnd w:id="16"/>
       <w:r>
@@ -3588,7 +2850,7 @@
     </w:p>
     <w:p>
       <w:r>
-        <w:t>Dù đạt 187/187 Unit Tests và hoạt động ổn định các tính năng cốt lõi (E2EE, File Transfer, TOFU), kiến trúc hệ thống bộc lộ giới hạn khi mở rộng (Scalability):</w:t>
+        <w:t>Dù đạt 200/200 Unit Tests và hoạt động ổn định các tính năng cốt lõi (E2EE, File Transfer, TOFU), kiến trúc hệ thống bộc lộ giới hạn khi mở rộng (Scalability):</w:t>
       </w:r>
     </w:p>
     <w:p>
@@ -3633,10 +2895,7 @@
       </w:pPr>
       <w:bookmarkStart w:id="17" w:name="_Toc233832285"/>
       <w:r>
-        <w:t>6</w:t>
-      </w:r>
-      <w:r>
-        <w:t>. THÔNG TIN REPOSITORY</w:t>
+        <w:t>6. THÔNG TIN REPOSITORY</w:t>
       </w:r>
       <w:bookmarkEnd w:id="17"/>
     </w:p>
@@ -3668,7 +2927,7 @@
         <w:jc w:val="center"/>
       </w:pPr>
       <w:r>
-        <w:t>pip install customtkinter cryptography PyJWT</w:t>
+        <w:t>pip install customtkinter cryptography PyJWT pywinstyles</w:t>
       </w:r>
     </w:p>
     <w:p>
@@ -3676,10 +2935,7 @@
         <w:jc w:val="center"/>
       </w:pPr>
       <w:r>
-        <w:t>p</w:t>
-      </w:r>
-      <w:r>
-        <w:t>ython Code/P2PChat/src/main.py</w:t>
+        <w:t>python Code/P2PChat/src/main.py</w:t>
       </w:r>
     </w:p>
     <w:p>
@@ -3692,10 +2948,7 @@
         <w:jc w:val="center"/>
       </w:pPr>
       <w:r>
-        <w:t xml:space="preserve">(Sẽ cập nhật </w:t>
-      </w:r>
-      <w:r>
-        <w:t>trước 11/7/2026)</w:t>
+        <w:t xml:space="preserve">(Sẽ cập nhật trước 11/7/2026)</w:t>
       </w:r>
     </w:p>
     <w:p/>

</xml_diff>